<commit_message>
junta medica - atualizações no sistema
</commit_message>
<xml_diff>
--- a/src/template/modelo_junta.docx
+++ b/src/template/modelo_junta.docx
@@ -5617,27 +5617,7 @@
                 <w:sz w:val="22"/>
                 <w:szCs w:val="22"/>
               </w:rPr>
-              <w:t xml:space="preserve">{% </w:t>
-            </w:r>
-            <w:proofErr w:type="spellStart"/>
-            <w:r>
-              <w:rPr>
-                <w:b/>
-                <w:bCs/>
-                <w:sz w:val="22"/>
-                <w:szCs w:val="22"/>
-              </w:rPr>
-              <w:t>tr</w:t>
-            </w:r>
-            <w:proofErr w:type="spellEnd"/>
-            <w:r>
-              <w:rPr>
-                <w:b/>
-                <w:bCs/>
-                <w:sz w:val="22"/>
-                <w:szCs w:val="22"/>
-              </w:rPr>
-              <w:t xml:space="preserve"> for item in curso %}</w:t>
+              <w:t xml:space="preserve">{%tr for item in curso %}</w:t>
             </w:r>
           </w:p>
         </w:tc>
@@ -6008,15 +5988,6 @@
           <w:sz w:val="22"/>
           <w:szCs w:val="22"/>
         </w:rPr>
-        <w:t>{%for item in apto%}</w:t>
-      </w:r>
-      <w:r>
-        <w:rPr>
-          <w:color w:val="000000" w:themeColor="text1"/>
-          <w:sz w:val="22"/>
-          <w:szCs w:val="22"/>
-        </w:rPr>
-        <w:t xml:space="preserve">                                                                                                                                                                                                                                                                                                                                                                                                                                                                                                                                                                                                                                                                                                                                                                                                                                                                                                                                                                                                                                                                                                                                                                                                                                                                          </w:t>
       </w:r>
     </w:p>
     <w:p>
@@ -6435,53 +6406,12 @@
           <w:sz w:val="22"/>
           <w:szCs w:val="22"/>
         </w:rPr>
-        <w:t>{%</w:t>
+        <w:t>{%endif%}</w:t>
       </w:r>
       <w:proofErr w:type="spellStart"/>
-      <w:r>
-        <w:rPr>
-          <w:color w:val="000000" w:themeColor="text1"/>
-          <w:sz w:val="22"/>
-          <w:szCs w:val="22"/>
-        </w:rPr>
-        <w:t>endfor</w:t>
-      </w:r>
       <w:proofErr w:type="spellEnd"/>
-      <w:r>
-        <w:rPr>
-          <w:color w:val="000000" w:themeColor="text1"/>
-          <w:sz w:val="22"/>
-          <w:szCs w:val="22"/>
-        </w:rPr>
-        <w:t>%}</w:t>
-      </w:r>
-      <w:r>
-        <w:rPr>
-          <w:color w:val="000000" w:themeColor="text1"/>
-          <w:sz w:val="22"/>
-          <w:szCs w:val="22"/>
-        </w:rPr>
-        <w:br/>
-        <w:t>{%</w:t>
-      </w:r>
       <w:proofErr w:type="spellStart"/>
-      <w:r>
-        <w:rPr>
-          <w:color w:val="000000" w:themeColor="text1"/>
-          <w:sz w:val="22"/>
-          <w:szCs w:val="22"/>
-        </w:rPr>
-        <w:t>endif</w:t>
-      </w:r>
       <w:proofErr w:type="spellEnd"/>
-      <w:r>
-        <w:rPr>
-          <w:color w:val="000000" w:themeColor="text1"/>
-          <w:sz w:val="22"/>
-          <w:szCs w:val="22"/>
-        </w:rPr>
-        <w:t>%}</w:t>
-      </w:r>
     </w:p>
     <w:p>
       <w:pPr>
@@ -6981,6 +6911,9 @@
           <w:szCs w:val="22"/>
         </w:rPr>
       </w:pPr>
+      <w:r>
+        <w:t>{%if tem_ltspf%}</w:t>
+      </w:r>
     </w:p>
     <w:p>
       <w:pPr>

</xml_diff>